<commit_message>
spec(ops): reorient Aman kickoff to day-to-day + task list
Kickoff now leads with Aman's daily work loop, weekly rhythm, and a concrete
week-1 task checklist (Google Workspace), with an 'add 3 of your own' prompt.
Drops comp from the call content and trims the strategy-heavy blocks. Daily
checklist rewritten to his actual tools (Drive + task sheet).

Co-Authored-By: Claude Opus 4.8 <noreply@anthropic.com>
</commit_message>
<xml_diff>
--- a/docs/superpowers/handoff/aman-internship/Aman_Daily_Checklist.docx
+++ b/docs/superpowers/handoff/aman-internship/Aman_Daily_Checklist.docx
@@ -132,7 +132,7 @@
           <w:i w:val="false"/>
           <w:iCs w:val="false"/>
         </w:rPr>
-        <w:t xml:space="preserve">Run this every day you work. It keeps you organized, keeps Daniel in the loop, and makes sure nothing stalls. It should take a few minutes at each end of the day, not more.</w:t>
+        <w:t xml:space="preserve">Run this every day you work. It keeps you organized, keeps Daniel in the loop, and makes sure nothing stalls. A few minutes at each end of the day.</w:t>
       </w:r>
     </w:p>
     <w:p>
@@ -141,6 +141,265 @@
       </w:pPr>
       <w:r>
         <w:t xml:space="preserve">Start of Day</w:t>
+      </w:r>
+    </w:p>
+    <w:p>
+      <w:pPr>
+        <w:spacing w:after="70"/>
+        <w:ind w:left="360"/>
+      </w:pPr>
+      <w:r>
+        <w:rPr>
+          <w:color w:val="1A2B4E"/>
+          <w:sz w:val="24"/>
+          <w:szCs w:val="24"/>
+        </w:rPr>
+        <w:t xml:space="preserve">☐  </w:t>
+      </w:r>
+      <w:r>
+        <w:rPr>
+          <w:color w:val="1A2B4E"/>
+          <w:sz w:val="22"/>
+          <w:szCs w:val="22"/>
+        </w:rPr>
+        <w:t xml:space="preserve">Open the Internal Operations folder in Google Drive and your task sheet.</w:t>
+      </w:r>
+    </w:p>
+    <w:p>
+      <w:pPr>
+        <w:spacing w:after="70"/>
+        <w:ind w:left="360"/>
+      </w:pPr>
+      <w:r>
+        <w:rPr>
+          <w:color w:val="1A2B4E"/>
+          <w:sz w:val="24"/>
+          <w:szCs w:val="24"/>
+        </w:rPr>
+        <w:t xml:space="preserve">☐  </w:t>
+      </w:r>
+      <w:r>
+        <w:rPr>
+          <w:color w:val="1A2B4E"/>
+          <w:sz w:val="22"/>
+          <w:szCs w:val="22"/>
+        </w:rPr>
+        <w:t xml:space="preserve">Check email and texts from Daniel since you last worked. Reply to the quick ones.</w:t>
+      </w:r>
+    </w:p>
+    <w:p>
+      <w:pPr>
+        <w:spacing w:after="70"/>
+        <w:ind w:left="360"/>
+      </w:pPr>
+      <w:r>
+        <w:rPr>
+          <w:color w:val="1A2B4E"/>
+          <w:sz w:val="24"/>
+          <w:szCs w:val="24"/>
+        </w:rPr>
+        <w:t xml:space="preserve">☐  </w:t>
+      </w:r>
+      <w:r>
+        <w:rPr>
+          <w:color w:val="1A2B4E"/>
+          <w:sz w:val="22"/>
+          <w:szCs w:val="22"/>
+        </w:rPr>
+        <w:t xml:space="preserve">Pick the one or two tasks you will finish today. Mark them In Progress in your sheet.</w:t>
+      </w:r>
+    </w:p>
+    <w:p>
+      <w:pPr>
+        <w:pStyle w:val="Heading1"/>
+      </w:pPr>
+      <w:r>
+        <w:t xml:space="preserve">During the Day</w:t>
+      </w:r>
+    </w:p>
+    <w:p>
+      <w:pPr>
+        <w:spacing w:after="70"/>
+        <w:ind w:left="360"/>
+      </w:pPr>
+      <w:r>
+        <w:rPr>
+          <w:color w:val="1A2B4E"/>
+          <w:sz w:val="24"/>
+          <w:szCs w:val="24"/>
+        </w:rPr>
+        <w:t xml:space="preserve">☐  </w:t>
+      </w:r>
+      <w:r>
+        <w:rPr>
+          <w:color w:val="1A2B4E"/>
+          <w:sz w:val="22"/>
+          <w:szCs w:val="22"/>
+        </w:rPr>
+        <w:t xml:space="preserve">Save everything in the right Drive folder, named clearly (date plus what it is).</w:t>
+      </w:r>
+    </w:p>
+    <w:p>
+      <w:pPr>
+        <w:spacing w:after="70"/>
+        <w:ind w:left="360"/>
+      </w:pPr>
+      <w:r>
+        <w:rPr>
+          <w:color w:val="1A2B4E"/>
+          <w:sz w:val="24"/>
+          <w:szCs w:val="24"/>
+        </w:rPr>
+        <w:t xml:space="preserve">☐  </w:t>
+      </w:r>
+      <w:r>
+        <w:rPr>
+          <w:color w:val="1A2B4E"/>
+          <w:sz w:val="22"/>
+          <w:szCs w:val="22"/>
+        </w:rPr>
+        <w:t xml:space="preserve">Keep your task sheet honest: Done, In Progress, or Blocked with a note.</w:t>
+      </w:r>
+    </w:p>
+    <w:p>
+      <w:pPr>
+        <w:spacing w:after="70"/>
+        <w:ind w:left="360"/>
+      </w:pPr>
+      <w:r>
+        <w:rPr>
+          <w:color w:val="1A2B4E"/>
+          <w:sz w:val="24"/>
+          <w:szCs w:val="24"/>
+        </w:rPr>
+        <w:t xml:space="preserve">☐  </w:t>
+      </w:r>
+      <w:r>
+        <w:rPr>
+          <w:color w:val="1A2B4E"/>
+          <w:sz w:val="22"/>
+          <w:szCs w:val="22"/>
+        </w:rPr>
+        <w:t xml:space="preserve">Tag every research source with its link so it is traceable later.</w:t>
+      </w:r>
+    </w:p>
+    <w:p>
+      <w:pPr>
+        <w:spacing w:after="70"/>
+        <w:ind w:left="360"/>
+      </w:pPr>
+      <w:r>
+        <w:rPr>
+          <w:color w:val="1A2B4E"/>
+          <w:sz w:val="24"/>
+          <w:szCs w:val="24"/>
+        </w:rPr>
+        <w:t xml:space="preserve">☐  </w:t>
+      </w:r>
+      <w:r>
+        <w:rPr>
+          <w:color w:val="1A2B4E"/>
+          <w:sz w:val="22"/>
+          <w:szCs w:val="22"/>
+        </w:rPr>
+        <w:t xml:space="preserve">Research and drafting only on anything PE or vendor related. No outside contact.</w:t>
+      </w:r>
+    </w:p>
+    <w:p>
+      <w:pPr>
+        <w:pStyle w:val="Heading1"/>
+      </w:pPr>
+      <w:r>
+        <w:t xml:space="preserve">End of Day  ·  Each Day You Work</w:t>
+      </w:r>
+    </w:p>
+    <w:p>
+      <w:pPr>
+        <w:spacing w:after="70"/>
+        <w:ind w:left="360"/>
+      </w:pPr>
+      <w:r>
+        <w:rPr>
+          <w:color w:val="1A2B4E"/>
+          <w:sz w:val="24"/>
+          <w:szCs w:val="24"/>
+        </w:rPr>
+        <w:t xml:space="preserve">☐  </w:t>
+      </w:r>
+      <w:r>
+        <w:rPr>
+          <w:color w:val="1A2B4E"/>
+          <w:sz w:val="22"/>
+          <w:szCs w:val="22"/>
+        </w:rPr>
+        <w:t xml:space="preserve">Update your task sheet and any trackers with what changed today.</w:t>
+      </w:r>
+    </w:p>
+    <w:p>
+      <w:pPr>
+        <w:spacing w:after="70"/>
+        <w:ind w:left="360"/>
+      </w:pPr>
+      <w:r>
+        <w:rPr>
+          <w:color w:val="1A2B4E"/>
+          <w:sz w:val="24"/>
+          <w:szCs w:val="24"/>
+        </w:rPr>
+        <w:t xml:space="preserve">☐  </w:t>
+      </w:r>
+      <w:r>
+        <w:rPr>
+          <w:color w:val="1A2B4E"/>
+          <w:sz w:val="22"/>
+          <w:szCs w:val="22"/>
+        </w:rPr>
+        <w:t xml:space="preserve">Submit your end-of-day report (link in the box below).</w:t>
+      </w:r>
+    </w:p>
+    <w:p>
+      <w:pPr>
+        <w:spacing w:after="70"/>
+        <w:ind w:left="360"/>
+      </w:pPr>
+      <w:r>
+        <w:rPr>
+          <w:color w:val="1A2B4E"/>
+          <w:sz w:val="24"/>
+          <w:szCs w:val="24"/>
+        </w:rPr>
+        <w:t xml:space="preserve">☐  </w:t>
+      </w:r>
+      <w:r>
+        <w:rPr>
+          <w:color w:val="1A2B4E"/>
+          <w:sz w:val="22"/>
+          <w:szCs w:val="22"/>
+        </w:rPr>
+        <w:t xml:space="preserve">Jot at least one improvement idea this week.</w:t>
+      </w:r>
+    </w:p>
+    <w:p>
+      <w:pPr>
+        <w:pStyle w:val="Heading1"/>
+      </w:pPr>
+      <w:r>
+        <w:t xml:space="preserve">When You Have Spare Time</w:t>
+      </w:r>
+    </w:p>
+    <w:p>
+      <w:pPr>
+        <w:spacing w:after="140"/>
+      </w:pPr>
+      <w:r>
+        <w:rPr>
+          <w:i/>
+          <w:iCs/>
+          <w:color w:val="595959"/>
+          <w:sz w:val="20"/>
+          <w:szCs w:val="20"/>
+        </w:rPr>
+        <w:t xml:space="preserve">When a task is blocked or you are waiting on Daniel, pick from here.</w:t>
       </w:r>
     </w:p>
     <w:p>
@@ -153,7 +412,7 @@
         <w:spacing w:after="60"/>
       </w:pPr>
       <w:r>
-        <w:t xml:space="preserve">Check Daniel's replies and any messages since you last worked.</w:t>
+        <w:t xml:space="preserve">Advance the buyer-universe research.</w:t>
       </w:r>
     </w:p>
     <w:p>
@@ -166,163 +425,7 @@
         <w:spacing w:after="60"/>
       </w:pPr>
       <w:r>
-        <w:t xml:space="preserve">Open your project trackers: the SOP audit matrix and the exit-readiness tracker.</w:t>
-      </w:r>
-    </w:p>
-    <w:p>
-      <w:pPr>
-        <w:pStyle w:val="ListParagraph"/>
-        <w:numPr>
-          <w:ilvl w:val="0"/>
-          <w:numId w:val="2"/>
-        </w:numPr>
-        <w:spacing w:after="60"/>
-      </w:pPr>
-      <w:r>
-        <w:t xml:space="preserve">Pick the top one or two outcomes you will move today. Write them down.</w:t>
-      </w:r>
-    </w:p>
-    <w:p>
-      <w:pPr>
-        <w:pStyle w:val="Heading1"/>
-      </w:pPr>
-      <w:r>
-        <w:t xml:space="preserve">During the Day</w:t>
-      </w:r>
-    </w:p>
-    <w:p>
-      <w:pPr>
-        <w:pStyle w:val="ListParagraph"/>
-        <w:numPr>
-          <w:ilvl w:val="0"/>
-          <w:numId w:val="2"/>
-        </w:numPr>
-        <w:spacing w:after="60"/>
-      </w:pPr>
-      <w:r>
-        <w:t xml:space="preserve">Log your work as you go. Keep the SOP audit matrix and exit-readiness tracker current.</w:t>
-      </w:r>
-    </w:p>
-    <w:p>
-      <w:pPr>
-        <w:pStyle w:val="ListParagraph"/>
-        <w:numPr>
-          <w:ilvl w:val="0"/>
-          <w:numId w:val="2"/>
-        </w:numPr>
-        <w:spacing w:after="60"/>
-      </w:pPr>
-      <w:r>
-        <w:t xml:space="preserve">Tag every research source so it is traceable later. A buyer will eventually ask how you know.</w:t>
-      </w:r>
-    </w:p>
-    <w:p>
-      <w:pPr>
-        <w:pStyle w:val="ListParagraph"/>
-        <w:numPr>
-          <w:ilvl w:val="0"/>
-          <w:numId w:val="2"/>
-        </w:numPr>
-        <w:spacing w:after="60"/>
-      </w:pPr>
-      <w:r>
-        <w:t xml:space="preserve">Research and drafting only on anything PE or vendor related. No outside contact.</w:t>
-      </w:r>
-    </w:p>
-    <w:p>
-      <w:pPr>
-        <w:pStyle w:val="Heading1"/>
-      </w:pPr>
-      <w:r>
-        <w:t xml:space="preserve">End of Day  ·  Each Day You Work</w:t>
-      </w:r>
-    </w:p>
-    <w:p>
-      <w:pPr>
-        <w:pStyle w:val="ListParagraph"/>
-        <w:numPr>
-          <w:ilvl w:val="0"/>
-          <w:numId w:val="2"/>
-        </w:numPr>
-        <w:spacing w:after="60"/>
-      </w:pPr>
-      <w:r>
-        <w:t xml:space="preserve">Update the trackers with what changed today.</w:t>
-      </w:r>
-    </w:p>
-    <w:p>
-      <w:pPr>
-        <w:pStyle w:val="ListParagraph"/>
-        <w:numPr>
-          <w:ilvl w:val="0"/>
-          <w:numId w:val="2"/>
-        </w:numPr>
-        <w:spacing w:after="60"/>
-      </w:pPr>
-      <w:r>
-        <w:t xml:space="preserve">Submit your end-of-day report (link in the box below).</w:t>
-      </w:r>
-    </w:p>
-    <w:p>
-      <w:pPr>
-        <w:pStyle w:val="ListParagraph"/>
-        <w:numPr>
-          <w:ilvl w:val="0"/>
-          <w:numId w:val="2"/>
-        </w:numPr>
-        <w:spacing w:after="60"/>
-      </w:pPr>
-      <w:r>
-        <w:t xml:space="preserve">Note at least one improvement idea this week.</w:t>
-      </w:r>
-    </w:p>
-    <w:p>
-      <w:pPr>
-        <w:pStyle w:val="Heading1"/>
-      </w:pPr>
-      <w:r>
-        <w:t xml:space="preserve">When You Have Spare Time</w:t>
-      </w:r>
-    </w:p>
-    <w:p>
-      <w:pPr>
-        <w:spacing w:after="140"/>
-      </w:pPr>
-      <w:r>
-        <w:rPr>
-          <w:i/>
-          <w:iCs/>
-          <w:color w:val="595959"/>
-          <w:sz w:val="20"/>
-          <w:szCs w:val="20"/>
-        </w:rPr>
-        <w:t xml:space="preserve">Downtime playbook. When a project is blocked or you are waiting on Daniel, pick from here.</w:t>
-      </w:r>
-    </w:p>
-    <w:p>
-      <w:pPr>
-        <w:pStyle w:val="ListParagraph"/>
-        <w:numPr>
-          <w:ilvl w:val="0"/>
-          <w:numId w:val="2"/>
-        </w:numPr>
-        <w:spacing w:after="60"/>
-      </w:pPr>
-      <w:r>
-        <w:t xml:space="preserve">Advance the buyer-universe research.</w:t>
-      </w:r>
-    </w:p>
-    <w:p>
-      <w:pPr>
-        <w:pStyle w:val="ListParagraph"/>
-        <w:numPr>
-          <w:ilvl w:val="0"/>
-          <w:numId w:val="2"/>
-        </w:numPr>
-        <w:spacing w:after="60"/>
-      </w:pPr>
-      <w:r>
-        <w:t xml:space="preserve">Clean up and reorganize the SOP and document library.</w:t>
+        <w:t xml:space="preserve">Clean up and reorganize the SOP and document library in Drive.</w:t>
       </w:r>
     </w:p>
     <w:p>

</xml_diff>

<commit_message>
spec(ops): make Aman kickoff collaborative + commit access/doc delivery
Adds 'Ask' prompts through every block (his read on the role, cadence, whether
the projects are the right start, what he'd change) and frames the task list as
a reshapeable starting point. Adds 'What You'll Get After This Call': same-day
platform access on request + all docs/reports/checklists sent after the call and
through the week as needed. Daily checklist gets the same access note.

Co-Authored-By: Claude Opus 4.8 <noreply@anthropic.com>
</commit_message>
<xml_diff>
--- a/docs/superpowers/handoff/aman-internship/Aman_Daily_Checklist.docx
+++ b/docs/superpowers/handoff/aman-internship/Aman_Daily_Checklist.docx
@@ -452,6 +452,20 @@
       </w:pPr>
       <w:r>
         <w:t xml:space="preserve">Read one diligence or trades-M&amp;A resource and bring back a takeaway.</w:t>
+      </w:r>
+    </w:p>
+    <w:p>
+      <w:pPr>
+        <w:spacing w:after="120" w:before="160"/>
+      </w:pPr>
+      <w:r>
+        <w:rPr>
+          <w:b w:val="false"/>
+          <w:bCs w:val="false"/>
+          <w:i w:val="false"/>
+          <w:iCs w:val="false"/>
+        </w:rPr>
+        <w:t xml:space="preserve">Need access to a tool, or another report or checklist? Text or email Daniel. You will have it the same day. Never sit blocked waiting on access.</w:t>
       </w:r>
     </w:p>
     <w:p>

</xml_diff>